<commit_message>
Coherence docs cadrage/archi + dashboard (KPI, couverture stock) + Gantt/Charte au reel + logo page 1
</commit_message>
<xml_diff>
--- a/00_CADRAGE/01_Cahier_des_charges.docx
+++ b/00_CADRAGE/01_Cahier_des_charges.docx
@@ -2,8 +2,45 @@
 <file path=word/document.xml><?xml version="1.0" encoding="utf-8"?>
 <w:document xmlns:wpc="http://schemas.microsoft.com/office/word/2010/wordprocessingCanvas" xmlns:cx="http://schemas.microsoft.com/office/drawing/2014/chartex" xmlns:cx1="http://schemas.microsoft.com/office/drawing/2015/9/8/chartex" xmlns:cx2="http://schemas.microsoft.com/office/drawing/2015/10/21/chartex" xmlns:cx3="http://schemas.microsoft.com/office/drawing/2016/5/9/chartex" xmlns:cx4="http://schemas.microsoft.com/office/drawing/2016/5/10/chartex" xmlns:cx5="http://schemas.microsoft.com/office/drawing/2016/5/11/chartex" xmlns:cx6="http://schemas.microsoft.com/office/drawing/2016/5/12/chartex" xmlns:cx7="http://schemas.microsoft.com/office/drawing/2016/5/13/chartex" xmlns:cx8="http://schemas.microsoft.com/office/drawing/2016/5/14/chartex" xmlns:mc="http://schemas.openxmlformats.org/markup-compatibility/2006" xmlns:aink="http://schemas.microsoft.com/office/drawing/2016/ink" xmlns:am3d="http://schemas.microsoft.com/office/drawing/2017/model3d" xmlns:o="urn:schemas-microsoft-com:office:office" xmlns:oel="http://schemas.microsoft.com/office/2019/extlst" xmlns:r="http://schemas.openxmlformats.org/officeDocument/2006/relationships" xmlns:m="http://schemas.openxmlformats.org/officeDocument/2006/math" xmlns:v="urn:schemas-microsoft-com:vml" xmlns:wp14="http://schemas.microsoft.com/office/word/2010/wordprocessingDrawing" xmlns:wp="http://schemas.openxmlformats.org/drawingml/2006/wordprocessingDrawing" xmlns:w10="urn:schemas-microsoft-com:office:word" xmlns:w="http://schemas.openxmlformats.org/wordprocessingml/2006/main" xmlns:w14="http://schemas.microsoft.com/office/word/2010/wordml" xmlns:w15="http://schemas.microsoft.com/office/word/2012/wordml" xmlns:w16cei="http://schemas.microsoft.com/office/word/2026/wordml/cei" xmlns:w16cex="http://schemas.microsoft.com/office/word/2018/wordml/cex" xmlns:w16cid="http://schemas.microsoft.com/office/word/2016/wordml/cid" xmlns:w16="http://schemas.microsoft.com/office/word/2018/wordml" xmlns:w16du="http://schemas.microsoft.com/office/word/2023/wordml/word16du" xmlns:w16sdtdh="http://schemas.microsoft.com/office/word/2020/wordml/sdtdatahash" xmlns:w16sdtfl="http://schemas.microsoft.com/office/word/2024/wordml/sdtformatlock" xmlns:w16se="http://schemas.microsoft.com/office/word/2015/wordml/symex" xmlns:wpg="http://schemas.microsoft.com/office/word/2010/wordprocessingGroup" xmlns:wpi="http://schemas.microsoft.com/office/word/2010/wordprocessingInk" xmlns:wne="http://schemas.microsoft.com/office/word/2006/wordml" xmlns:wps="http://schemas.microsoft.com/office/word/2010/wordprocessingShape" mc:Ignorable="w14 w15 w16se w16cid w16 w16cex w16sdtdh w16sdtfl w16du wp14">
   <w:body>
-    <w:p/>
-    <w:p/>
+    <w:p>
+      <w:pPr>
+        <w:jc w:val="center"/>
+      </w:pPr>
+      <w:r>
+        <w:drawing>
+          <wp:inline xmlns:a="http://schemas.openxmlformats.org/drawingml/2006/main" xmlns:pic="http://schemas.openxmlformats.org/drawingml/2006/picture">
+            <wp:extent cx="3780000" cy="2520000"/>
+            <wp:docPr id="1" name="Picture 1"/>
+            <wp:cNvGraphicFramePr>
+              <a:graphicFrameLocks noChangeAspect="1"/>
+            </wp:cNvGraphicFramePr>
+            <a:graphic>
+              <a:graphicData uri="http://schemas.openxmlformats.org/drawingml/2006/picture">
+                <pic:pic>
+                  <pic:nvPicPr>
+                    <pic:cNvPr id="0" name="image.png"/>
+                    <pic:cNvPicPr/>
+                  </pic:nvPicPr>
+                  <pic:blipFill>
+                    <a:blip r:embed="rId13"/>
+                    <a:stretch>
+                      <a:fillRect/>
+                    </a:stretch>
+                  </pic:blipFill>
+                  <pic:spPr>
+                    <a:xfrm>
+                      <a:off x="0" y="0"/>
+                      <a:ext cx="3780000" cy="2520000"/>
+                    </a:xfrm>
+                    <a:prstGeom prst="rect"/>
+                  </pic:spPr>
+                </pic:pic>
+              </a:graphicData>
+            </a:graphic>
+          </wp:inline>
+        </w:drawing>
+      </w:r>
+    </w:p>
     <w:p/>
     <w:p>
       <w:pPr>
@@ -43,23 +80,13 @@
       <w:pPr>
         <w:jc w:val="center"/>
       </w:pPr>
-      <w:proofErr w:type="gramStart"/>
       <w:r>
         <w:rPr>
           <w:i/>
           <w:color w:val="127A8A"/>
           <w:sz w:val="30"/>
         </w:rPr>
-        <w:t>pour</w:t>
-      </w:r>
-      <w:proofErr w:type="gramEnd"/>
-      <w:r>
-        <w:rPr>
-          <w:i/>
-          <w:color w:val="127A8A"/>
-          <w:sz w:val="30"/>
-        </w:rPr>
-        <w:t xml:space="preserve"> un e-commerce local</w:t>
+        <w:t>pour un e-commerce local</w:t>
       </w:r>
     </w:p>
     <w:p/>
@@ -93,7 +120,6 @@
           <w:lang w:val="en-US"/>
         </w:rPr>
       </w:pPr>
-      <w:proofErr w:type="gramStart"/>
       <w:r>
         <w:rPr>
           <w:b/>
@@ -101,17 +127,7 @@
           <w:sz w:val="24"/>
           <w:lang w:val="en-US"/>
         </w:rPr>
-        <w:t>Module :</w:t>
-      </w:r>
-      <w:proofErr w:type="gramEnd"/>
-      <w:r>
-        <w:rPr>
-          <w:b/>
-          <w:color w:val="0F2A43"/>
-          <w:sz w:val="24"/>
-          <w:lang w:val="en-US"/>
-        </w:rPr>
-        <w:t xml:space="preserve"> </w:t>
+        <w:t xml:space="preserve">Module : </w:t>
       </w:r>
       <w:r>
         <w:rPr>
@@ -119,25 +135,7 @@
           <w:sz w:val="24"/>
           <w:lang w:val="en-US"/>
         </w:rPr>
-        <w:t xml:space="preserve">Gestion de </w:t>
-      </w:r>
-      <w:proofErr w:type="spellStart"/>
-      <w:r>
-        <w:rPr>
-          <w:color w:val="555555"/>
-          <w:sz w:val="24"/>
-          <w:lang w:val="en-US"/>
-        </w:rPr>
-        <w:t>Projet</w:t>
-      </w:r>
-      <w:proofErr w:type="spellEnd"/>
-      <w:r>
-        <w:rPr>
-          <w:color w:val="555555"/>
-          <w:sz w:val="24"/>
-          <w:lang w:val="en-US"/>
-        </w:rPr>
-        <w:t xml:space="preserve"> Data &amp; E-Business</w:t>
+        <w:t>Gestion de Projet Data &amp; E-Business</w:t>
       </w:r>
     </w:p>
     <w:p>
@@ -147,7 +145,6 @@
           <w:lang w:val="en-US"/>
         </w:rPr>
       </w:pPr>
-      <w:proofErr w:type="gramStart"/>
       <w:r>
         <w:rPr>
           <w:b/>
@@ -155,17 +152,7 @@
           <w:sz w:val="24"/>
           <w:lang w:val="en-US"/>
         </w:rPr>
-        <w:t>Formation :</w:t>
-      </w:r>
-      <w:proofErr w:type="gramEnd"/>
-      <w:r>
-        <w:rPr>
-          <w:b/>
-          <w:color w:val="0F2A43"/>
-          <w:sz w:val="24"/>
-          <w:lang w:val="en-US"/>
-        </w:rPr>
-        <w:t xml:space="preserve"> </w:t>
+        <w:t xml:space="preserve">Formation : </w:t>
       </w:r>
       <w:r>
         <w:rPr>
@@ -310,15 +297,7 @@
     </w:p>
     <w:p>
       <w:r>
-        <w:t>Concevoir et livrer une plateforme data-</w:t>
-      </w:r>
-      <w:proofErr w:type="spellStart"/>
-      <w:r>
-        <w:t>driven</w:t>
-      </w:r>
-      <w:proofErr w:type="spellEnd"/>
-      <w:r>
-        <w:t xml:space="preserve"> capable d'aider Teranga Market à maximiser sa marge et fidéliser ses clients, à travers trois leviers intelligents :</w:t>
+        <w:t>Concevoir et livrer une plateforme data-driven capable d'aider Teranga Market à maximiser sa marge et fidéliser ses clients, à travers trois leviers intelligents :</w:t>
       </w:r>
     </w:p>
     <w:p>
@@ -342,23 +321,7 @@
         <w:pStyle w:val="Listepuces"/>
       </w:pPr>
       <w:r>
-        <w:t>Recommander les bons produits à chaque client (cross-</w:t>
-      </w:r>
-      <w:proofErr w:type="spellStart"/>
-      <w:r>
-        <w:t>sell</w:t>
-      </w:r>
-      <w:proofErr w:type="spellEnd"/>
-      <w:r>
-        <w:t xml:space="preserve"> / up-</w:t>
-      </w:r>
-      <w:proofErr w:type="spellStart"/>
-      <w:r>
-        <w:t>sell</w:t>
-      </w:r>
-      <w:proofErr w:type="spellEnd"/>
-      <w:r>
-        <w:t>).</w:t>
+        <w:t>Recommander les bons produits à chaque client (cross-sell / up-sell).</w:t>
       </w:r>
     </w:p>
     <w:p>
@@ -574,21 +537,14 @@
               <w:rPr>
                 <w:sz w:val="20"/>
               </w:rPr>
-              <w:t>Améliorer la marge brute (</w:t>
+              <w:t xml:space="preserve">Améliorer la marge brute (pricing </w:t>
             </w:r>
-            <w:proofErr w:type="spellStart"/>
             <w:r>
               <w:rPr>
                 <w:sz w:val="20"/>
               </w:rPr>
-              <w:t>pricing</w:t>
-            </w:r>
-            <w:proofErr w:type="spellEnd"/>
-            <w:r>
-              <w:rPr>
-                <w:sz w:val="20"/>
-              </w:rPr>
-              <w:t xml:space="preserve"> dynamique)</w:t>
+              <w:lastRenderedPageBreak/>
+              <w:t>dynamique)</w:t>
             </w:r>
           </w:p>
         </w:tc>
@@ -610,6 +566,7 @@
               <w:rPr>
                 <w:sz w:val="20"/>
               </w:rPr>
+              <w:lastRenderedPageBreak/>
               <w:t>Marge brute (%)</w:t>
             </w:r>
           </w:p>
@@ -966,16 +923,8 @@
               <w:rPr>
                 <w:sz w:val="20"/>
               </w:rPr>
-              <w:t xml:space="preserve">Taux de </w:t>
+              <w:t>Taux de churn</w:t>
             </w:r>
-            <w:proofErr w:type="spellStart"/>
-            <w:r>
-              <w:rPr>
-                <w:sz w:val="20"/>
-              </w:rPr>
-              <w:t>churn</w:t>
-            </w:r>
-            <w:proofErr w:type="spellEnd"/>
           </w:p>
         </w:tc>
         <w:tc>
@@ -1057,7 +1006,6 @@
           <w:color w:val="127A8A"/>
           <w:sz w:val="26"/>
         </w:rPr>
-        <w:lastRenderedPageBreak/>
         <w:t>4.1 Paramètres du jeu de données synthétique</w:t>
       </w:r>
     </w:p>
@@ -1429,26 +1377,8 @@
             </w:tcMar>
           </w:tcPr>
           <w:p>
-            <w:pPr>
-              <w:spacing w:after="40"/>
-            </w:pPr>
             <w:r>
-              <w:rPr>
-                <w:sz w:val="20"/>
-              </w:rPr>
-              <w:t xml:space="preserve">FCFA (de </w:t>
-            </w:r>
-            <w:r>
-              <w:rPr>
-                <w:sz w:val="20"/>
-              </w:rPr>
-              <w:t>1</w:t>
-            </w:r>
-            <w:r>
-              <w:rPr>
-                <w:sz w:val="20"/>
-              </w:rPr>
-              <w:t xml:space="preserve"> 000 à 1 500 000)</w:t>
+              <w:t>FCFA (de 3 000 à 1 500 000)</w:t>
             </w:r>
           </w:p>
         </w:tc>
@@ -1490,6 +1420,7 @@
         <w:pStyle w:val="Listepuces"/>
       </w:pPr>
       <w:r>
+        <w:lastRenderedPageBreak/>
         <w:t>Pipeline de données : ingestion (batch + streaming simulé), stockage (Data Lake + Data Warehouse), contrôles qualité.</w:t>
       </w:r>
     </w:p>
@@ -1506,7 +1437,7 @@
         <w:pStyle w:val="Listepuces"/>
       </w:pPr>
       <w:r>
-        <w:t>API exposant prix dynamique et recommandations.</w:t>
+        <w:t>API exposant prix dynamique et recommandations, avec MLOps léger (MLflow, monitoring de dérive PSI, CI/CD).</w:t>
       </w:r>
     </w:p>
     <w:p>
@@ -1514,7 +1445,13 @@
         <w:pStyle w:val="Listepuces"/>
       </w:pPr>
       <w:r>
-        <w:t>Tableau de bord décisionnel (KPIs métier).</w:t>
+        <w:t>Tableau de bord décisionnel (KPI, opportunités de prix, simulateur, remises par segment, prévision, promotions, carte du Sénégal, reco en direct</w:t>
+      </w:r>
+      <w:r>
+        <w:t>, couverture de stock</w:t>
+      </w:r>
+      <w:r>
+        <w:t>).</w:t>
       </w:r>
     </w:p>
     <w:p>
@@ -1828,16 +1765,8 @@
               <w:rPr>
                 <w:sz w:val="20"/>
               </w:rPr>
-              <w:t xml:space="preserve">Data </w:t>
+              <w:t>Data Engineer</w:t>
             </w:r>
-            <w:proofErr w:type="spellStart"/>
-            <w:r>
-              <w:rPr>
-                <w:sz w:val="20"/>
-              </w:rPr>
-              <w:t>Engineer</w:t>
-            </w:r>
-            <w:proofErr w:type="spellEnd"/>
           </w:p>
         </w:tc>
       </w:tr>
@@ -1908,16 +1837,8 @@
               <w:rPr>
                 <w:sz w:val="20"/>
               </w:rPr>
-              <w:t xml:space="preserve">Data </w:t>
+              <w:t>Data Engineer</w:t>
             </w:r>
-            <w:proofErr w:type="spellStart"/>
-            <w:r>
-              <w:rPr>
-                <w:sz w:val="20"/>
-              </w:rPr>
-              <w:t>Engineer</w:t>
-            </w:r>
-            <w:proofErr w:type="spellEnd"/>
           </w:p>
         </w:tc>
       </w:tr>
@@ -1945,7 +1866,6 @@
                 <w:b/>
                 <w:sz w:val="20"/>
               </w:rPr>
-              <w:lastRenderedPageBreak/>
               <w:t>L4</w:t>
             </w:r>
           </w:p>
@@ -1992,16 +1912,8 @@
               <w:rPr>
                 <w:sz w:val="20"/>
               </w:rPr>
-              <w:t xml:space="preserve">Data Eng. / Data </w:t>
+              <w:t>Data Eng. / Data Scientist</w:t>
             </w:r>
-            <w:proofErr w:type="spellStart"/>
-            <w:r>
-              <w:rPr>
-                <w:sz w:val="20"/>
-              </w:rPr>
-              <w:t>Scientist</w:t>
-            </w:r>
-            <w:proofErr w:type="spellEnd"/>
           </w:p>
         </w:tc>
       </w:tr>
@@ -2050,35 +1962,7 @@
               <w:rPr>
                 <w:sz w:val="20"/>
               </w:rPr>
-              <w:t>Modèles entraînés + évaluation (</w:t>
-            </w:r>
-            <w:proofErr w:type="spellStart"/>
-            <w:r>
-              <w:rPr>
-                <w:sz w:val="20"/>
-              </w:rPr>
-              <w:t>metrics</w:t>
-            </w:r>
-            <w:proofErr w:type="spellEnd"/>
-            <w:r>
-              <w:rPr>
-                <w:sz w:val="20"/>
-              </w:rPr>
-              <w:t xml:space="preserve">, </w:t>
-            </w:r>
-            <w:proofErr w:type="spellStart"/>
-            <w:r>
-              <w:rPr>
-                <w:sz w:val="20"/>
-              </w:rPr>
-              <w:t>baselines</w:t>
-            </w:r>
-            <w:proofErr w:type="spellEnd"/>
-            <w:r>
-              <w:rPr>
-                <w:sz w:val="20"/>
-              </w:rPr>
-              <w:t>)</w:t>
+              <w:t>Modèles entraînés + évaluation (metrics, baselines)</w:t>
             </w:r>
           </w:p>
         </w:tc>
@@ -2100,16 +1984,8 @@
               <w:rPr>
                 <w:sz w:val="20"/>
               </w:rPr>
-              <w:t xml:space="preserve">Data </w:t>
+              <w:t>Data Scientist</w:t>
             </w:r>
-            <w:proofErr w:type="spellStart"/>
-            <w:r>
-              <w:rPr>
-                <w:sz w:val="20"/>
-              </w:rPr>
-              <w:t>Scientist</w:t>
-            </w:r>
-            <w:proofErr w:type="spellEnd"/>
           </w:p>
         </w:tc>
       </w:tr>
@@ -2160,21 +2036,7 @@
               <w:rPr>
                 <w:sz w:val="20"/>
               </w:rPr>
-              <w:t xml:space="preserve">API </w:t>
-            </w:r>
-            <w:proofErr w:type="spellStart"/>
-            <w:r>
-              <w:rPr>
-                <w:sz w:val="20"/>
-              </w:rPr>
-              <w:t>dockerisée</w:t>
-            </w:r>
-            <w:proofErr w:type="spellEnd"/>
-            <w:r>
-              <w:rPr>
-                <w:sz w:val="20"/>
-              </w:rPr>
-              <w:t xml:space="preserve"> (recommandations / prix)</w:t>
+              <w:t>API dockerisée + MLOps (reco / prix ; MLflow, monitoring, CI/CD)</w:t>
             </w:r>
           </w:p>
         </w:tc>
@@ -2193,14 +2055,12 @@
             <w:pPr>
               <w:spacing w:after="40"/>
             </w:pPr>
-            <w:proofErr w:type="spellStart"/>
             <w:r>
               <w:rPr>
                 <w:sz w:val="20"/>
               </w:rPr>
               <w:t>MLOps</w:t>
             </w:r>
-            <w:proofErr w:type="spellEnd"/>
           </w:p>
         </w:tc>
       </w:tr>
@@ -2253,23 +2113,7 @@
                 <w:sz w:val="20"/>
                 <w:lang w:val="en-US"/>
               </w:rPr>
-              <w:t xml:space="preserve">Dashboard </w:t>
-            </w:r>
-            <w:proofErr w:type="spellStart"/>
-            <w:r>
-              <w:rPr>
-                <w:sz w:val="20"/>
-                <w:lang w:val="en-US"/>
-              </w:rPr>
-              <w:t>interactif</w:t>
-            </w:r>
-            <w:proofErr w:type="spellEnd"/>
-            <w:r>
-              <w:rPr>
-                <w:sz w:val="20"/>
-                <w:lang w:val="en-US"/>
-              </w:rPr>
-              <w:t xml:space="preserve"> + rapport business (KPI, ROI)</w:t>
+              <w:t>Dashboard interactif + rapport business (KPI, ROI)</w:t>
             </w:r>
           </w:p>
         </w:tc>
@@ -2291,16 +2135,8 @@
               <w:rPr>
                 <w:sz w:val="20"/>
               </w:rPr>
-              <w:t xml:space="preserve">BI / Business </w:t>
+              <w:t>BI / Business Analyst</w:t>
             </w:r>
-            <w:proofErr w:type="spellStart"/>
-            <w:r>
-              <w:rPr>
-                <w:sz w:val="20"/>
-              </w:rPr>
-              <w:t>Analyst</w:t>
-            </w:r>
-            <w:proofErr w:type="spellEnd"/>
           </w:p>
         </w:tc>
       </w:tr>
@@ -2328,6 +2164,7 @@
                 <w:b/>
                 <w:sz w:val="20"/>
               </w:rPr>
+              <w:lastRenderedPageBreak/>
               <w:t>L8</w:t>
             </w:r>
           </w:p>
@@ -2403,31 +2240,7 @@
     </w:p>
     <w:p>
       <w:r>
-        <w:t xml:space="preserve">Le groupe est composé de 4 membres. Le sujet prévoit 5 rôles : le rôle </w:t>
-      </w:r>
-      <w:proofErr w:type="spellStart"/>
-      <w:r>
-        <w:t>MLOps</w:t>
-      </w:r>
-      <w:proofErr w:type="spellEnd"/>
-      <w:r>
-        <w:t xml:space="preserve"> est fusionné avec la BI / Business </w:t>
-      </w:r>
-      <w:proofErr w:type="spellStart"/>
-      <w:r>
-        <w:t>Analyst</w:t>
-      </w:r>
-      <w:proofErr w:type="spellEnd"/>
-      <w:r>
-        <w:t xml:space="preserve"> (P4), qui met les modèles en production et les rend visibles dans le </w:t>
-      </w:r>
-      <w:proofErr w:type="spellStart"/>
-      <w:r>
-        <w:t>dashboard</w:t>
-      </w:r>
-      <w:proofErr w:type="spellEnd"/>
-      <w:r>
-        <w:t>.</w:t>
+        <w:t>Le groupe est composé de 4 membres. Le sujet prévoit 5 rôles : le rôle MLOps est fusionné avec la BI / Business Analyst (P4), qui met les modèles en production et les rend visibles dans le dashboard.</w:t>
       </w:r>
     </w:p>
     <w:tbl>
@@ -2601,21 +2414,7 @@
               <w:rPr>
                 <w:sz w:val="20"/>
               </w:rPr>
-              <w:t>(</w:t>
-            </w:r>
-            <w:proofErr w:type="gramStart"/>
-            <w:r>
-              <w:rPr>
-                <w:sz w:val="20"/>
-              </w:rPr>
-              <w:t>à</w:t>
-            </w:r>
-            <w:proofErr w:type="gramEnd"/>
-            <w:r>
-              <w:rPr>
-                <w:sz w:val="20"/>
-              </w:rPr>
-              <w:t xml:space="preserve"> compléter)</w:t>
+              <w:t>Pauline N. N. CISSE</w:t>
             </w:r>
           </w:p>
         </w:tc>
@@ -2706,26 +2505,16 @@
           <w:p>
             <w:pPr>
               <w:spacing w:after="40"/>
+              <w:rPr>
+                <w:lang w:val="en-US"/>
+              </w:rPr>
             </w:pPr>
             <w:r>
               <w:rPr>
                 <w:sz w:val="20"/>
+                <w:lang w:val="en-US"/>
               </w:rPr>
-              <w:t>(</w:t>
-            </w:r>
-            <w:proofErr w:type="gramStart"/>
-            <w:r>
-              <w:rPr>
-                <w:sz w:val="20"/>
-              </w:rPr>
-              <w:t>à</w:t>
-            </w:r>
-            <w:proofErr w:type="gramEnd"/>
-            <w:r>
-              <w:rPr>
-                <w:sz w:val="20"/>
-              </w:rPr>
-              <w:t xml:space="preserve"> compléter)</w:t>
+              <w:t>Luc-Yvan H NZEE EVOUNDZA</w:t>
             </w:r>
           </w:p>
         </w:tc>
@@ -2748,16 +2537,8 @@
               <w:rPr>
                 <w:sz w:val="20"/>
               </w:rPr>
-              <w:t xml:space="preserve">Data </w:t>
+              <w:t>Data Engineer</w:t>
             </w:r>
-            <w:proofErr w:type="spellStart"/>
-            <w:r>
-              <w:rPr>
-                <w:sz w:val="20"/>
-              </w:rPr>
-              <w:t>Engineer</w:t>
-            </w:r>
-            <w:proofErr w:type="spellEnd"/>
           </w:p>
         </w:tc>
         <w:tc>
@@ -2775,33 +2556,11 @@
             <w:pPr>
               <w:spacing w:after="40"/>
             </w:pPr>
-            <w:proofErr w:type="spellStart"/>
             <w:r>
               <w:rPr>
                 <w:sz w:val="20"/>
               </w:rPr>
-              <w:t>Dataset</w:t>
-            </w:r>
-            <w:proofErr w:type="spellEnd"/>
-            <w:r>
-              <w:rPr>
-                <w:sz w:val="20"/>
-              </w:rPr>
-              <w:t xml:space="preserve"> synthétique, ingestion Spark, streaming Kafka, contrôles qualité, orchestration </w:t>
-            </w:r>
-            <w:proofErr w:type="spellStart"/>
-            <w:r>
-              <w:rPr>
-                <w:sz w:val="20"/>
-              </w:rPr>
-              <w:t>Airflow</w:t>
-            </w:r>
-            <w:proofErr w:type="spellEnd"/>
-            <w:r>
-              <w:rPr>
-                <w:sz w:val="20"/>
-              </w:rPr>
-              <w:t>, schéma</w:t>
+              <w:t>Dataset synthétique, ingestion Spark, streaming Kafka, contrôles qualité, orchestration Airflow, schéma</w:t>
             </w:r>
           </w:p>
         </w:tc>
@@ -2851,21 +2610,7 @@
               <w:rPr>
                 <w:sz w:val="20"/>
               </w:rPr>
-              <w:t>(</w:t>
-            </w:r>
-            <w:proofErr w:type="gramStart"/>
-            <w:r>
-              <w:rPr>
-                <w:sz w:val="20"/>
-              </w:rPr>
-              <w:t>à</w:t>
-            </w:r>
-            <w:proofErr w:type="gramEnd"/>
-            <w:r>
-              <w:rPr>
-                <w:sz w:val="20"/>
-              </w:rPr>
-              <w:t xml:space="preserve"> compléter)</w:t>
+              <w:t>Nihad A TRAORE</w:t>
             </w:r>
           </w:p>
         </w:tc>
@@ -2887,16 +2632,8 @@
               <w:rPr>
                 <w:sz w:val="20"/>
               </w:rPr>
-              <w:t xml:space="preserve">Data </w:t>
+              <w:t>Data Scientist</w:t>
             </w:r>
-            <w:proofErr w:type="spellStart"/>
-            <w:r>
-              <w:rPr>
-                <w:sz w:val="20"/>
-              </w:rPr>
-              <w:t>Scientist</w:t>
-            </w:r>
-            <w:proofErr w:type="spellEnd"/>
           </w:p>
         </w:tc>
         <w:tc>
@@ -2917,35 +2654,7 @@
               <w:rPr>
                 <w:sz w:val="20"/>
               </w:rPr>
-              <w:t>Prévision de demande, optimisation de prix, recommandation, évaluation (</w:t>
-            </w:r>
-            <w:proofErr w:type="spellStart"/>
-            <w:r>
-              <w:rPr>
-                <w:sz w:val="20"/>
-              </w:rPr>
-              <w:t>metrics</w:t>
-            </w:r>
-            <w:proofErr w:type="spellEnd"/>
-            <w:r>
-              <w:rPr>
-                <w:sz w:val="20"/>
-              </w:rPr>
-              <w:t xml:space="preserve"> + </w:t>
-            </w:r>
-            <w:proofErr w:type="spellStart"/>
-            <w:r>
-              <w:rPr>
-                <w:sz w:val="20"/>
-              </w:rPr>
-              <w:t>baselines</w:t>
-            </w:r>
-            <w:proofErr w:type="spellEnd"/>
-            <w:r>
-              <w:rPr>
-                <w:sz w:val="20"/>
-              </w:rPr>
-              <w:t>), notebooks</w:t>
+              <w:t>Prévision de demande, optimisation de prix, recommandation, évaluation (metrics + baselines), notebooks</w:t>
             </w:r>
           </w:p>
         </w:tc>
@@ -2997,21 +2706,7 @@
               <w:rPr>
                 <w:sz w:val="20"/>
               </w:rPr>
-              <w:t>(</w:t>
-            </w:r>
-            <w:proofErr w:type="gramStart"/>
-            <w:r>
-              <w:rPr>
-                <w:sz w:val="20"/>
-              </w:rPr>
-              <w:t>à</w:t>
-            </w:r>
-            <w:proofErr w:type="gramEnd"/>
-            <w:r>
-              <w:rPr>
-                <w:sz w:val="20"/>
-              </w:rPr>
-              <w:t xml:space="preserve"> compléter)</w:t>
+              <w:t>Sona KOULIBALY</w:t>
             </w:r>
           </w:p>
         </w:tc>
@@ -3030,28 +2725,12 @@
             <w:pPr>
               <w:spacing w:after="40"/>
             </w:pPr>
-            <w:proofErr w:type="spellStart"/>
             <w:r>
               <w:rPr>
                 <w:sz w:val="20"/>
               </w:rPr>
-              <w:t>MLOps</w:t>
+              <w:t>MLOps + BI / Analyst</w:t>
             </w:r>
-            <w:proofErr w:type="spellEnd"/>
-            <w:r>
-              <w:rPr>
-                <w:sz w:val="20"/>
-              </w:rPr>
-              <w:t xml:space="preserve"> + BI / </w:t>
-            </w:r>
-            <w:proofErr w:type="spellStart"/>
-            <w:r>
-              <w:rPr>
-                <w:sz w:val="20"/>
-              </w:rPr>
-              <w:t>Analyst</w:t>
-            </w:r>
-            <w:proofErr w:type="spellEnd"/>
           </w:p>
         </w:tc>
         <w:tc>
@@ -3077,53 +2756,7 @@
                 <w:sz w:val="20"/>
                 <w:lang w:val="en-US"/>
               </w:rPr>
-              <w:t xml:space="preserve">API </w:t>
-            </w:r>
-            <w:proofErr w:type="spellStart"/>
-            <w:r>
-              <w:rPr>
-                <w:sz w:val="20"/>
-                <w:lang w:val="en-US"/>
-              </w:rPr>
-              <w:t>FastAPI</w:t>
-            </w:r>
-            <w:proofErr w:type="spellEnd"/>
-            <w:r>
-              <w:rPr>
-                <w:sz w:val="20"/>
-                <w:lang w:val="en-US"/>
-              </w:rPr>
-              <w:t xml:space="preserve"> + Docker, dashboard </w:t>
-            </w:r>
-            <w:r>
-              <w:rPr>
-                <w:sz w:val="20"/>
-                <w:lang w:val="en-US"/>
-              </w:rPr>
-              <w:t>Dash</w:t>
-            </w:r>
-            <w:r>
-              <w:rPr>
-                <w:sz w:val="20"/>
-                <w:lang w:val="en-US"/>
-              </w:rPr>
-              <w:t xml:space="preserve"> (KPIs), business case, </w:t>
-            </w:r>
-            <w:proofErr w:type="spellStart"/>
-            <w:r>
-              <w:rPr>
-                <w:sz w:val="20"/>
-                <w:lang w:val="en-US"/>
-              </w:rPr>
-              <w:t>démo</w:t>
-            </w:r>
-            <w:proofErr w:type="spellEnd"/>
-            <w:r>
-              <w:rPr>
-                <w:sz w:val="20"/>
-                <w:lang w:val="en-US"/>
-              </w:rPr>
-              <w:t xml:space="preserve"> finale</w:t>
+              <w:t>MLOps (MLflow, monitoring, CI/CD), API FastAPI + Docker, dashboard Dash, business case, démo finale</w:t>
             </w:r>
           </w:p>
         </w:tc>
@@ -3142,21 +2775,7 @@
         <w:rPr>
           <w:color w:val="555555"/>
         </w:rPr>
-        <w:t xml:space="preserve">Ordre de travail (dépendances) : P2 (données) → P3 (modèles) → P4 (API + </w:t>
-      </w:r>
-      <w:proofErr w:type="spellStart"/>
-      <w:r>
-        <w:rPr>
-          <w:color w:val="555555"/>
-        </w:rPr>
-        <w:t>dashboard</w:t>
-      </w:r>
-      <w:proofErr w:type="spellEnd"/>
-      <w:r>
-        <w:rPr>
-          <w:color w:val="555555"/>
-        </w:rPr>
-        <w:t>). P1 assure le cadrage et la coordination du début à la fin. La répartition détaillée (Responsable / Consulté / Informé) est fournie dans la matrice RACI.</w:t>
+        <w:t>Ordre de travail (dépendances) : P2 (données) → P3 (modèles) → P4 (API + dashboard). P1 assure le cadrage et la coordination du début à la fin. La répartition détaillée (Responsable / Consulté / Informé) est fournie dans la matrice RACI.</w:t>
       </w:r>
     </w:p>
     <w:p>
@@ -3180,13 +2799,8 @@
         <w:pStyle w:val="Listepuces"/>
       </w:pPr>
       <w:r>
-        <w:t>Délai : projet réalisé su</w:t>
-      </w:r>
-      <w:r>
-        <w:t>r</w:t>
-      </w:r>
-      <w:r>
-        <w:t xml:space="preserve"> 2 semaines).</w:t>
+        <w:lastRenderedPageBreak/>
+        <w:t>Délai : projet réalisé sur 2 semaines).</w:t>
       </w:r>
     </w:p>
     <w:p>
@@ -3204,53 +2818,11 @@
           <w:lang w:val="en-US"/>
         </w:rPr>
       </w:pPr>
-      <w:proofErr w:type="gramStart"/>
       <w:r>
         <w:rPr>
           <w:lang w:val="en-US"/>
         </w:rPr>
-        <w:t>Techniques :</w:t>
-      </w:r>
-      <w:proofErr w:type="gramEnd"/>
-      <w:r>
-        <w:rPr>
-          <w:lang w:val="en-US"/>
-        </w:rPr>
-        <w:t xml:space="preserve"> Spark, Kafka, Airflow (via Docker) + Python (Prophet/</w:t>
-      </w:r>
-      <w:proofErr w:type="spellStart"/>
-      <w:r>
-        <w:rPr>
-          <w:lang w:val="en-US"/>
-        </w:rPr>
-        <w:t>LightGBM</w:t>
-      </w:r>
-      <w:proofErr w:type="spellEnd"/>
-      <w:r>
-        <w:rPr>
-          <w:lang w:val="en-US"/>
-        </w:rPr>
-        <w:t xml:space="preserve">, scikit-learn), API </w:t>
-      </w:r>
-      <w:proofErr w:type="spellStart"/>
-      <w:r>
-        <w:rPr>
-          <w:lang w:val="en-US"/>
-        </w:rPr>
-        <w:t>FastAPI</w:t>
-      </w:r>
-      <w:proofErr w:type="spellEnd"/>
-      <w:r>
-        <w:rPr>
-          <w:lang w:val="en-US"/>
-        </w:rPr>
-        <w:t xml:space="preserve"> + Docker, dashboard</w:t>
-      </w:r>
-      <w:r>
-        <w:rPr>
-          <w:lang w:val="en-US"/>
-        </w:rPr>
-        <w:t>.</w:t>
+        <w:t>Techniques : Spark, Kafka, Airflow (via Docker) + Python (Prophet/LightGBM, scikit-learn), API FastAPI + Docker, dashboard.</w:t>
       </w:r>
     </w:p>
     <w:p>
@@ -3258,7 +2830,6 @@
         <w:pStyle w:val="Listepuces"/>
       </w:pPr>
       <w:r>
-        <w:lastRenderedPageBreak/>
         <w:t>Conformité : respect du RGPD (données synthétiques, démarche de conformité documentée).</w:t>
       </w:r>
     </w:p>
@@ -3299,15 +2870,7 @@
         <w:pStyle w:val="Listepuces"/>
       </w:pPr>
       <w:r>
-        <w:t xml:space="preserve">La chaîne fonctionne de bout en bout : des données brutes jusqu'à une décision (prix / reco) visible dans le </w:t>
-      </w:r>
-      <w:proofErr w:type="spellStart"/>
-      <w:r>
-        <w:t>dashboard</w:t>
-      </w:r>
-      <w:proofErr w:type="spellEnd"/>
-      <w:r>
-        <w:t>.</w:t>
+        <w:t>La chaîne fonctionne de bout en bout : des données brutes jusqu'à une décision (prix / reco) visible dans le dashboard.</w:t>
       </w:r>
     </w:p>
     <w:p>
@@ -3315,23 +2878,7 @@
         <w:pStyle w:val="Listepuces"/>
       </w:pPr>
       <w:r>
-        <w:t>Chaque modèle est évalué (</w:t>
-      </w:r>
-      <w:proofErr w:type="spellStart"/>
-      <w:r>
-        <w:t>metrics</w:t>
-      </w:r>
-      <w:proofErr w:type="spellEnd"/>
-      <w:r>
-        <w:t xml:space="preserve"> + </w:t>
-      </w:r>
-      <w:proofErr w:type="spellStart"/>
-      <w:r>
-        <w:t>baseline</w:t>
-      </w:r>
-      <w:proofErr w:type="spellEnd"/>
-      <w:r>
-        <w:t xml:space="preserve"> de comparaison).</w:t>
+        <w:t>Chaque modèle est évalué (metrics + baseline de comparaison).</w:t>
       </w:r>
     </w:p>
     <w:p>
@@ -3577,16 +3124,8 @@
               <w:rPr>
                 <w:sz w:val="20"/>
               </w:rPr>
-              <w:t xml:space="preserve">Utilisateurs du </w:t>
+              <w:t>Utilisateurs du dashboard</w:t>
             </w:r>
-            <w:proofErr w:type="spellStart"/>
-            <w:r>
-              <w:rPr>
-                <w:sz w:val="20"/>
-              </w:rPr>
-              <w:t>dashboard</w:t>
-            </w:r>
-            <w:proofErr w:type="spellEnd"/>
           </w:p>
         </w:tc>
         <w:tc>
@@ -3843,11 +3382,14 @@
         <w:rPr>
           <w:color w:val="555555"/>
         </w:rPr>
+        <w:lastRenderedPageBreak/>
         <w:t>La cartographie détaillée des parties prenantes (matrice Pouvoir / Intérêt) est développée dans un document dédié.</w:t>
       </w:r>
     </w:p>
     <w:sectPr>
-      <w:footerReference w:type="default" r:id="rId8"/>
+      <w:headerReference w:type="default" r:id="rId8"/>
+      <w:footerReference w:type="default" r:id="rId9"/>
+      <w:headerReference w:type="first" r:id="rId12"/>
       <w:pgSz w:w="12240" w:h="15840"/>
       <w:pgMar w:top="1440" w:right="1800" w:bottom="1440" w:left="1800" w:header="720" w:footer="720" w:gutter="0"/>
       <w:cols w:space="720"/>
@@ -3894,23 +3436,7 @@
         <w:color w:val="555555"/>
         <w:sz w:val="16"/>
       </w:rPr>
-      <w:t xml:space="preserve">Cahier des charges — Teranga </w:t>
-    </w:r>
-    <w:proofErr w:type="gramStart"/>
-    <w:r>
-      <w:rPr>
-        <w:color w:val="555555"/>
-        <w:sz w:val="16"/>
-      </w:rPr>
-      <w:t>Market  |</w:t>
-    </w:r>
-    <w:proofErr w:type="gramEnd"/>
-    <w:r>
-      <w:rPr>
-        <w:color w:val="555555"/>
-        <w:sz w:val="16"/>
-      </w:rPr>
-      <w:t xml:space="preserve">  Page </w:t>
+      <w:t xml:space="preserve">Cahier des charges — Teranga Market  |  Page </w:t>
     </w:r>
     <w:r>
       <w:fldChar w:fldCharType="begin"/>
@@ -3960,6 +3486,26 @@
     </w:p>
   </w:footnote>
 </w:footnotes>
+</file>
+
+<file path=word/header1.xml><?xml version="1.0" encoding="utf-8"?>
+<w:hdr xmlns:wpc="http://schemas.microsoft.com/office/word/2010/wordprocessingCanvas" xmlns:cx="http://schemas.microsoft.com/office/drawing/2014/chartex" xmlns:cx1="http://schemas.microsoft.com/office/drawing/2015/9/8/chartex" xmlns:cx2="http://schemas.microsoft.com/office/drawing/2015/10/21/chartex" xmlns:cx3="http://schemas.microsoft.com/office/drawing/2016/5/9/chartex" xmlns:cx4="http://schemas.microsoft.com/office/drawing/2016/5/10/chartex" xmlns:cx5="http://schemas.microsoft.com/office/drawing/2016/5/11/chartex" xmlns:cx6="http://schemas.microsoft.com/office/drawing/2016/5/12/chartex" xmlns:cx7="http://schemas.microsoft.com/office/drawing/2016/5/13/chartex" xmlns:cx8="http://schemas.microsoft.com/office/drawing/2016/5/14/chartex" xmlns:mc="http://schemas.openxmlformats.org/markup-compatibility/2006" xmlns:aink="http://schemas.microsoft.com/office/drawing/2016/ink" xmlns:am3d="http://schemas.microsoft.com/office/drawing/2017/model3d" xmlns:o="urn:schemas-microsoft-com:office:office" xmlns:oel="http://schemas.microsoft.com/office/2019/extlst" xmlns:r="http://schemas.openxmlformats.org/officeDocument/2006/relationships" xmlns:m="http://schemas.openxmlformats.org/officeDocument/2006/math" xmlns:v="urn:schemas-microsoft-com:vml" xmlns:wp14="http://schemas.microsoft.com/office/word/2010/wordprocessingDrawing" xmlns:wp="http://schemas.openxmlformats.org/drawingml/2006/wordprocessingDrawing" xmlns:w10="urn:schemas-microsoft-com:office:word" xmlns:w="http://schemas.openxmlformats.org/wordprocessingml/2006/main" xmlns:w14="http://schemas.microsoft.com/office/word/2010/wordml" xmlns:w15="http://schemas.microsoft.com/office/word/2012/wordml" xmlns:w16cei="http://schemas.microsoft.com/office/word/2026/wordml/cei" xmlns:w16cex="http://schemas.microsoft.com/office/word/2018/wordml/cex" xmlns:w16cid="http://schemas.microsoft.com/office/word/2016/wordml/cid" xmlns:w16="http://schemas.microsoft.com/office/word/2018/wordml" xmlns:w16du="http://schemas.microsoft.com/office/word/2023/wordml/word16du" xmlns:w16sdtdh="http://schemas.microsoft.com/office/word/2020/wordml/sdtdatahash" xmlns:w16sdtfl="http://schemas.microsoft.com/office/word/2024/wordml/sdtformatlock" xmlns:w16se="http://schemas.microsoft.com/office/word/2015/wordml/symex" xmlns:wpg="http://schemas.microsoft.com/office/word/2010/wordprocessingGroup" xmlns:wpi="http://schemas.microsoft.com/office/word/2010/wordprocessingInk" xmlns:wne="http://schemas.microsoft.com/office/word/2006/wordml" xmlns:wps="http://schemas.microsoft.com/office/word/2010/wordprocessingShape" mc:Ignorable="w14 w15 w16se w16cid w16 w16cex w16sdtdh w16sdtfl w16du wp14">
+  <w:p>
+    <w:pPr>
+      <w:jc w:val="center"/>
+    </w:pPr>
+  </w:p>
+</w:hdr>
+</file>
+
+<file path=word/header2.xml><?xml version="1.0" encoding="utf-8"?>
+<w:hdr xmlns:m="http://schemas.openxmlformats.org/officeDocument/2006/math" xmlns:mc="http://schemas.openxmlformats.org/markup-compatibility/2006" xmlns:mo="http://schemas.microsoft.com/office/mac/office/2008/main" xmlns:mv="urn:schemas-microsoft-com:mac:vml" xmlns:o="urn:schemas-microsoft-com:office:office" xmlns:r="http://schemas.openxmlformats.org/officeDocument/2006/relationships" xmlns:v="urn:schemas-microsoft-com:vml" xmlns:w10="urn:schemas-microsoft-com:office:word" xmlns:w14="http://schemas.microsoft.com/office/word/2010/wordml" xmlns:w="http://schemas.openxmlformats.org/wordprocessingml/2006/main" xmlns:wne="http://schemas.microsoft.com/office/word/2006/wordml" xmlns:wp14="http://schemas.microsoft.com/office/word/2010/wordprocessingDrawing" xmlns:wp="http://schemas.openxmlformats.org/drawingml/2006/wordprocessingDrawing" xmlns:wpc="http://schemas.microsoft.com/office/word/2010/wordprocessingCanvas" xmlns:wpg="http://schemas.microsoft.com/office/word/2010/wordprocessingGroup" xmlns:wpi="http://schemas.microsoft.com/office/word/2010/wordprocessingInk" xmlns:wps="http://schemas.microsoft.com/office/word/2010/wordprocessingShape" mc:Ignorable="w14 wp14">
+  <w:p>
+    <w:pPr>
+      <w:pStyle w:val="Header"/>
+    </w:pPr>
+  </w:p>
+</w:hdr>
 </file>
 
 <file path=word/numbering.xml><?xml version="1.0" encoding="utf-8"?>

</xml_diff>